<commit_message>
Update OMIS lab-1 lab-2 Create OVIS lab-3
</commit_message>
<xml_diff>
--- a/course-3_semester-1/OMIS/lab-2/lab-2.docx
+++ b/course-3_semester-1/OMIS/lab-2/lab-2.docx
@@ -857,16 +857,15 @@
         <w:rPr>
           <w:rFonts w:ascii="Times New Roman" w:eastAsia="Times New Roman" w:hAnsi="Times New Roman" w:cs="Times New Roman"/>
           <w:b/>
-          <w:noProof/>
           <w:sz w:val="30"/>
           <w:szCs w:val="30"/>
         </w:rPr>
         <w:lastRenderedPageBreak/>
         <w:drawing>
-          <wp:inline distT="0" distB="0" distL="0" distR="0" wp14:anchorId="3F2A50B3" wp14:editId="20CC3D04">
-            <wp:extent cx="6123940" cy="1917065"/>
-            <wp:effectExtent l="0" t="0" r="0" b="6985"/>
-            <wp:docPr id="896572797" name="Рисунок 1" descr="Изображение выглядит как диаграмма, текст, линия, План&#10;&#10;Содержимое, созданное искусственным интеллектом, может быть неверным."/>
+          <wp:inline distT="0" distB="0" distL="0" distR="0" wp14:anchorId="2565C8A8" wp14:editId="63025062">
+            <wp:extent cx="6123940" cy="1880235"/>
+            <wp:effectExtent l="0" t="0" r="0" b="5715"/>
+            <wp:docPr id="18419612" name="Рисунок 1"/>
             <wp:cNvGraphicFramePr>
               <a:graphicFrameLocks xmlns:a="http://schemas.openxmlformats.org/drawingml/2006/main" noChangeAspect="1"/>
             </wp:cNvGraphicFramePr>
@@ -874,7 +873,7 @@
               <a:graphicData uri="http://schemas.openxmlformats.org/drawingml/2006/picture">
                 <pic:pic xmlns:pic="http://schemas.openxmlformats.org/drawingml/2006/picture">
                   <pic:nvPicPr>
-                    <pic:cNvPr id="896572797" name="Рисунок 1" descr="Изображение выглядит как диаграмма, текст, линия, План&#10;&#10;Содержимое, созданное искусственным интеллектом, может быть неверным."/>
+                    <pic:cNvPr id="18419612" name=""/>
                     <pic:cNvPicPr/>
                   </pic:nvPicPr>
                   <pic:blipFill>
@@ -886,7 +885,7 @@
                   <pic:spPr>
                     <a:xfrm>
                       <a:off x="0" y="0"/>
-                      <a:ext cx="6123940" cy="1917065"/>
+                      <a:ext cx="6123940" cy="1880235"/>
                     </a:xfrm>
                     <a:prstGeom prst="rect">
                       <a:avLst/>
@@ -921,10 +920,10 @@
           <w:lang w:val="ru-RU"/>
         </w:rPr>
         <w:drawing>
-          <wp:inline distT="0" distB="0" distL="0" distR="0" wp14:anchorId="6680B027" wp14:editId="226F89B0">
-            <wp:extent cx="6123940" cy="2876550"/>
-            <wp:effectExtent l="0" t="0" r="0" b="0"/>
-            <wp:docPr id="553735339" name="Рисунок 1" descr="Изображение выглядит как диаграмма, текст, Технический чертеж, План&#10;&#10;Содержимое, созданное искусственным интеллектом, может быть неверным."/>
+          <wp:inline distT="0" distB="0" distL="0" distR="0" wp14:anchorId="7499784C" wp14:editId="7155151F">
+            <wp:extent cx="6123940" cy="2911475"/>
+            <wp:effectExtent l="0" t="0" r="0" b="3175"/>
+            <wp:docPr id="1888756084" name="Рисунок 1"/>
             <wp:cNvGraphicFramePr>
               <a:graphicFrameLocks xmlns:a="http://schemas.openxmlformats.org/drawingml/2006/main" noChangeAspect="1"/>
             </wp:cNvGraphicFramePr>
@@ -932,7 +931,7 @@
               <a:graphicData uri="http://schemas.openxmlformats.org/drawingml/2006/picture">
                 <pic:pic xmlns:pic="http://schemas.openxmlformats.org/drawingml/2006/picture">
                   <pic:nvPicPr>
-                    <pic:cNvPr id="553735339" name="Рисунок 1" descr="Изображение выглядит как диаграмма, текст, Технический чертеж, План&#10;&#10;Содержимое, созданное искусственным интеллектом, может быть неверным."/>
+                    <pic:cNvPr id="1888756084" name=""/>
                     <pic:cNvPicPr/>
                   </pic:nvPicPr>
                   <pic:blipFill>
@@ -944,7 +943,7 @@
                   <pic:spPr>
                     <a:xfrm>
                       <a:off x="0" y="0"/>
-                      <a:ext cx="6123940" cy="2876550"/>
+                      <a:ext cx="6123940" cy="2911475"/>
                     </a:xfrm>
                     <a:prstGeom prst="rect">
                       <a:avLst/>

</xml_diff>